<commit_message>
Update Customer Segmentation documentation.docx
</commit_message>
<xml_diff>
--- a/Customer Segmentation documentation.docx
+++ b/Customer Segmentation documentation.docx
@@ -13949,6 +13949,2033 @@
         <w:t>Can Python?</w:t>
       </w:r>
     </w:p>
+    <w:p>
+      <w:pPr>
+        <w:pStyle w:val="ListParagraph"/>
+        <w:numPr>
+          <w:ilvl w:val="0"/>
+          <w:numId w:val="1"/>
+        </w:numPr>
+      </w:pPr>
+      <w:r>
+        <w:t>Python analysis Part 1</w:t>
+      </w:r>
+    </w:p>
+    <w:p>
+      <w:pPr>
+        <w:pStyle w:val="ListParagraph"/>
+        <w:numPr>
+          <w:ilvl w:val="1"/>
+          <w:numId w:val="1"/>
+        </w:numPr>
+      </w:pPr>
+      <w:r>
+        <w:t xml:space="preserve">Gender and Income under </w:t>
+      </w:r>
+      <w:r>
+        <w:t>filtered_completedoffers_offers_trial</w:t>
+      </w:r>
+      <w:r>
+        <w:t xml:space="preserve"> have 1135 null values.</w:t>
+      </w:r>
+    </w:p>
+    <w:p>
+      <w:pPr>
+        <w:pStyle w:val="ListParagraph"/>
+        <w:numPr>
+          <w:ilvl w:val="1"/>
+          <w:numId w:val="1"/>
+        </w:numPr>
+      </w:pPr>
+      <w:r>
+        <w:t>But there are 0 null values.</w:t>
+      </w:r>
+    </w:p>
+    <w:p>
+      <w:pPr>
+        <w:pStyle w:val="ListParagraph"/>
+        <w:numPr>
+          <w:ilvl w:val="1"/>
+          <w:numId w:val="1"/>
+        </w:numPr>
+      </w:pPr>
+      <w:r>
+        <w:t>These are customers that are below 118 years old (technically below 110) but have no gender and income values?</w:t>
+      </w:r>
+    </w:p>
+    <w:p>
+      <w:pPr>
+        <w:pStyle w:val="ListParagraph"/>
+        <w:numPr>
+          <w:ilvl w:val="1"/>
+          <w:numId w:val="1"/>
+        </w:numPr>
+        <w:shd w:val="clear" w:color="auto" w:fill="1F1F1F"/>
+        <w:spacing w:after="0" w:line="285" w:lineRule="atLeast"/>
+        <w:rPr>
+          <w:rFonts w:ascii="Consolas" w:eastAsia="Times New Roman" w:hAnsi="Consolas" w:cs="Times New Roman"/>
+          <w:color w:val="CCCCCC"/>
+          <w:kern w:val="0"/>
+          <w:sz w:val="21"/>
+          <w:szCs w:val="21"/>
+          <w:lang w:eastAsia="en-PH"/>
+          <w14:ligatures w14:val="none"/>
+        </w:rPr>
+      </w:pPr>
+      <w:r>
+        <w:rPr>
+          <w:rFonts w:ascii="Consolas" w:eastAsia="Times New Roman" w:hAnsi="Consolas" w:cs="Times New Roman"/>
+          <w:color w:val="9CDCFE"/>
+          <w:kern w:val="0"/>
+          <w:sz w:val="21"/>
+          <w:szCs w:val="21"/>
+          <w:lang w:eastAsia="en-PH"/>
+          <w14:ligatures w14:val="none"/>
+        </w:rPr>
+        <w:t>df_null_gender</w:t>
+      </w:r>
+      <w:r>
+        <w:rPr>
+          <w:rFonts w:ascii="Consolas" w:eastAsia="Times New Roman" w:hAnsi="Consolas" w:cs="Times New Roman"/>
+          <w:color w:val="CCCCCC"/>
+          <w:kern w:val="0"/>
+          <w:sz w:val="21"/>
+          <w:szCs w:val="21"/>
+          <w:lang w:eastAsia="en-PH"/>
+          <w14:ligatures w14:val="none"/>
+        </w:rPr>
+        <w:t xml:space="preserve"> </w:t>
+      </w:r>
+      <w:r>
+        <w:rPr>
+          <w:rFonts w:ascii="Consolas" w:eastAsia="Times New Roman" w:hAnsi="Consolas" w:cs="Times New Roman"/>
+          <w:color w:val="D4D4D4"/>
+          <w:kern w:val="0"/>
+          <w:sz w:val="21"/>
+          <w:szCs w:val="21"/>
+          <w:lang w:eastAsia="en-PH"/>
+          <w14:ligatures w14:val="none"/>
+        </w:rPr>
+        <w:t>=</w:t>
+      </w:r>
+      <w:r>
+        <w:rPr>
+          <w:rFonts w:ascii="Consolas" w:eastAsia="Times New Roman" w:hAnsi="Consolas" w:cs="Times New Roman"/>
+          <w:color w:val="CCCCCC"/>
+          <w:kern w:val="0"/>
+          <w:sz w:val="21"/>
+          <w:szCs w:val="21"/>
+          <w:lang w:eastAsia="en-PH"/>
+          <w14:ligatures w14:val="none"/>
+        </w:rPr>
+        <w:t xml:space="preserve"> </w:t>
+      </w:r>
+      <w:r>
+        <w:rPr>
+          <w:rFonts w:ascii="Consolas" w:eastAsia="Times New Roman" w:hAnsi="Consolas" w:cs="Times New Roman"/>
+          <w:color w:val="9CDCFE"/>
+          <w:kern w:val="0"/>
+          <w:sz w:val="21"/>
+          <w:szCs w:val="21"/>
+          <w:lang w:eastAsia="en-PH"/>
+          <w14:ligatures w14:val="none"/>
+        </w:rPr>
+        <w:t>filtered_completedoffers_offers_trial</w:t>
+      </w:r>
+      <w:r>
+        <w:rPr>
+          <w:rFonts w:ascii="Consolas" w:eastAsia="Times New Roman" w:hAnsi="Consolas" w:cs="Times New Roman"/>
+          <w:color w:val="CCCCCC"/>
+          <w:kern w:val="0"/>
+          <w:sz w:val="21"/>
+          <w:szCs w:val="21"/>
+          <w:lang w:eastAsia="en-PH"/>
+          <w14:ligatures w14:val="none"/>
+        </w:rPr>
+        <w:t>[</w:t>
+      </w:r>
+      <w:r>
+        <w:rPr>
+          <w:rFonts w:ascii="Consolas" w:eastAsia="Times New Roman" w:hAnsi="Consolas" w:cs="Times New Roman"/>
+          <w:color w:val="9CDCFE"/>
+          <w:kern w:val="0"/>
+          <w:sz w:val="21"/>
+          <w:szCs w:val="21"/>
+          <w:lang w:eastAsia="en-PH"/>
+          <w14:ligatures w14:val="none"/>
+        </w:rPr>
+        <w:t>filtered_completedoffers_offers_trial</w:t>
+      </w:r>
+      <w:r>
+        <w:rPr>
+          <w:rFonts w:ascii="Consolas" w:eastAsia="Times New Roman" w:hAnsi="Consolas" w:cs="Times New Roman"/>
+          <w:color w:val="CCCCCC"/>
+          <w:kern w:val="0"/>
+          <w:sz w:val="21"/>
+          <w:szCs w:val="21"/>
+          <w:lang w:eastAsia="en-PH"/>
+          <w14:ligatures w14:val="none"/>
+        </w:rPr>
+        <w:t>[</w:t>
+      </w:r>
+      <w:r>
+        <w:rPr>
+          <w:rFonts w:ascii="Consolas" w:eastAsia="Times New Roman" w:hAnsi="Consolas" w:cs="Times New Roman"/>
+          <w:color w:val="CE9178"/>
+          <w:kern w:val="0"/>
+          <w:sz w:val="21"/>
+          <w:szCs w:val="21"/>
+          <w:lang w:eastAsia="en-PH"/>
+          <w14:ligatures w14:val="none"/>
+        </w:rPr>
+        <w:t>'gender'</w:t>
+      </w:r>
+      <w:r>
+        <w:rPr>
+          <w:rFonts w:ascii="Consolas" w:eastAsia="Times New Roman" w:hAnsi="Consolas" w:cs="Times New Roman"/>
+          <w:color w:val="CCCCCC"/>
+          <w:kern w:val="0"/>
+          <w:sz w:val="21"/>
+          <w:szCs w:val="21"/>
+          <w:lang w:eastAsia="en-PH"/>
+          <w14:ligatures w14:val="none"/>
+        </w:rPr>
+        <w:t>].</w:t>
+      </w:r>
+      <w:r>
+        <w:rPr>
+          <w:rFonts w:ascii="Consolas" w:eastAsia="Times New Roman" w:hAnsi="Consolas" w:cs="Times New Roman"/>
+          <w:color w:val="DCDCAA"/>
+          <w:kern w:val="0"/>
+          <w:sz w:val="21"/>
+          <w:szCs w:val="21"/>
+          <w:lang w:eastAsia="en-PH"/>
+          <w14:ligatures w14:val="none"/>
+        </w:rPr>
+        <w:t>isnull</w:t>
+      </w:r>
+      <w:r>
+        <w:rPr>
+          <w:rFonts w:ascii="Consolas" w:eastAsia="Times New Roman" w:hAnsi="Consolas" w:cs="Times New Roman"/>
+          <w:color w:val="CCCCCC"/>
+          <w:kern w:val="0"/>
+          <w:sz w:val="21"/>
+          <w:szCs w:val="21"/>
+          <w:lang w:eastAsia="en-PH"/>
+          <w14:ligatures w14:val="none"/>
+        </w:rPr>
+        <w:t>()]</w:t>
+      </w:r>
+    </w:p>
+    <w:p>
+      <w:pPr>
+        <w:pStyle w:val="ListParagraph"/>
+        <w:numPr>
+          <w:ilvl w:val="1"/>
+          <w:numId w:val="1"/>
+        </w:numPr>
+        <w:shd w:val="clear" w:color="auto" w:fill="1F1F1F"/>
+        <w:spacing w:after="0" w:line="285" w:lineRule="atLeast"/>
+        <w:rPr>
+          <w:rFonts w:ascii="Consolas" w:eastAsia="Times New Roman" w:hAnsi="Consolas" w:cs="Times New Roman"/>
+          <w:color w:val="CCCCCC"/>
+          <w:kern w:val="0"/>
+          <w:sz w:val="21"/>
+          <w:szCs w:val="21"/>
+          <w:lang w:eastAsia="en-PH"/>
+          <w14:ligatures w14:val="none"/>
+        </w:rPr>
+      </w:pPr>
+      <w:r>
+        <w:rPr>
+          <w:rFonts w:ascii="Consolas" w:eastAsia="Times New Roman" w:hAnsi="Consolas" w:cs="Times New Roman"/>
+          <w:color w:val="4EC9B0"/>
+          <w:kern w:val="0"/>
+          <w:sz w:val="21"/>
+          <w:szCs w:val="21"/>
+          <w:lang w:eastAsia="en-PH"/>
+          <w14:ligatures w14:val="none"/>
+        </w:rPr>
+        <w:t>pd</w:t>
+      </w:r>
+      <w:r>
+        <w:rPr>
+          <w:rFonts w:ascii="Consolas" w:eastAsia="Times New Roman" w:hAnsi="Consolas" w:cs="Times New Roman"/>
+          <w:color w:val="CCCCCC"/>
+          <w:kern w:val="0"/>
+          <w:sz w:val="21"/>
+          <w:szCs w:val="21"/>
+          <w:lang w:eastAsia="en-PH"/>
+          <w14:ligatures w14:val="none"/>
+        </w:rPr>
+        <w:t>.</w:t>
+      </w:r>
+      <w:r>
+        <w:rPr>
+          <w:rFonts w:ascii="Consolas" w:eastAsia="Times New Roman" w:hAnsi="Consolas" w:cs="Times New Roman"/>
+          <w:color w:val="DCDCAA"/>
+          <w:kern w:val="0"/>
+          <w:sz w:val="21"/>
+          <w:szCs w:val="21"/>
+          <w:lang w:eastAsia="en-PH"/>
+          <w14:ligatures w14:val="none"/>
+        </w:rPr>
+        <w:t>set_option</w:t>
+      </w:r>
+      <w:r>
+        <w:rPr>
+          <w:rFonts w:ascii="Consolas" w:eastAsia="Times New Roman" w:hAnsi="Consolas" w:cs="Times New Roman"/>
+          <w:color w:val="CCCCCC"/>
+          <w:kern w:val="0"/>
+          <w:sz w:val="21"/>
+          <w:szCs w:val="21"/>
+          <w:lang w:eastAsia="en-PH"/>
+          <w14:ligatures w14:val="none"/>
+        </w:rPr>
+        <w:t>(</w:t>
+      </w:r>
+      <w:r>
+        <w:rPr>
+          <w:rFonts w:ascii="Consolas" w:eastAsia="Times New Roman" w:hAnsi="Consolas" w:cs="Times New Roman"/>
+          <w:color w:val="CE9178"/>
+          <w:kern w:val="0"/>
+          <w:sz w:val="21"/>
+          <w:szCs w:val="21"/>
+          <w:lang w:eastAsia="en-PH"/>
+          <w14:ligatures w14:val="none"/>
+        </w:rPr>
+        <w:t>'display.max_columns'</w:t>
+      </w:r>
+      <w:r>
+        <w:rPr>
+          <w:rFonts w:ascii="Consolas" w:eastAsia="Times New Roman" w:hAnsi="Consolas" w:cs="Times New Roman"/>
+          <w:color w:val="CCCCCC"/>
+          <w:kern w:val="0"/>
+          <w:sz w:val="21"/>
+          <w:szCs w:val="21"/>
+          <w:lang w:eastAsia="en-PH"/>
+          <w14:ligatures w14:val="none"/>
+        </w:rPr>
+        <w:t xml:space="preserve">, </w:t>
+      </w:r>
+      <w:r>
+        <w:rPr>
+          <w:rFonts w:ascii="Consolas" w:eastAsia="Times New Roman" w:hAnsi="Consolas" w:cs="Times New Roman"/>
+          <w:color w:val="569CD6"/>
+          <w:kern w:val="0"/>
+          <w:sz w:val="21"/>
+          <w:szCs w:val="21"/>
+          <w:lang w:eastAsia="en-PH"/>
+          <w14:ligatures w14:val="none"/>
+        </w:rPr>
+        <w:t>None</w:t>
+      </w:r>
+      <w:r>
+        <w:rPr>
+          <w:rFonts w:ascii="Consolas" w:eastAsia="Times New Roman" w:hAnsi="Consolas" w:cs="Times New Roman"/>
+          <w:color w:val="CCCCCC"/>
+          <w:kern w:val="0"/>
+          <w:sz w:val="21"/>
+          <w:szCs w:val="21"/>
+          <w:lang w:eastAsia="en-PH"/>
+          <w14:ligatures w14:val="none"/>
+        </w:rPr>
+        <w:t>)</w:t>
+      </w:r>
+    </w:p>
+    <w:p>
+      <w:pPr>
+        <w:pStyle w:val="ListParagraph"/>
+        <w:numPr>
+          <w:ilvl w:val="1"/>
+          <w:numId w:val="1"/>
+        </w:numPr>
+        <w:shd w:val="clear" w:color="auto" w:fill="1F1F1F"/>
+        <w:spacing w:after="0" w:line="285" w:lineRule="atLeast"/>
+        <w:rPr>
+          <w:rFonts w:ascii="Consolas" w:eastAsia="Times New Roman" w:hAnsi="Consolas" w:cs="Times New Roman"/>
+          <w:color w:val="CCCCCC"/>
+          <w:kern w:val="0"/>
+          <w:sz w:val="21"/>
+          <w:szCs w:val="21"/>
+          <w:lang w:eastAsia="en-PH"/>
+          <w14:ligatures w14:val="none"/>
+        </w:rPr>
+      </w:pPr>
+    </w:p>
+    <w:p>
+      <w:pPr>
+        <w:pStyle w:val="ListParagraph"/>
+        <w:numPr>
+          <w:ilvl w:val="1"/>
+          <w:numId w:val="1"/>
+        </w:numPr>
+        <w:shd w:val="clear" w:color="auto" w:fill="1F1F1F"/>
+        <w:spacing w:after="0" w:line="285" w:lineRule="atLeast"/>
+        <w:rPr>
+          <w:rFonts w:ascii="Consolas" w:eastAsia="Times New Roman" w:hAnsi="Consolas" w:cs="Times New Roman"/>
+          <w:color w:val="CCCCCC"/>
+          <w:kern w:val="0"/>
+          <w:sz w:val="21"/>
+          <w:szCs w:val="21"/>
+          <w:lang w:eastAsia="en-PH"/>
+          <w14:ligatures w14:val="none"/>
+        </w:rPr>
+      </w:pPr>
+      <w:r>
+        <w:rPr>
+          <w:rFonts w:ascii="Consolas" w:eastAsia="Times New Roman" w:hAnsi="Consolas" w:cs="Times New Roman"/>
+          <w:color w:val="9CDCFE"/>
+          <w:kern w:val="0"/>
+          <w:sz w:val="21"/>
+          <w:szCs w:val="21"/>
+          <w:lang w:eastAsia="en-PH"/>
+          <w14:ligatures w14:val="none"/>
+        </w:rPr>
+        <w:t>df_null_gender</w:t>
+      </w:r>
+      <w:r>
+        <w:rPr>
+          <w:rFonts w:ascii="Consolas" w:eastAsia="Times New Roman" w:hAnsi="Consolas" w:cs="Times New Roman"/>
+          <w:color w:val="CCCCCC"/>
+          <w:kern w:val="0"/>
+          <w:sz w:val="21"/>
+          <w:szCs w:val="21"/>
+          <w:lang w:eastAsia="en-PH"/>
+          <w14:ligatures w14:val="none"/>
+        </w:rPr>
+        <w:t>.</w:t>
+      </w:r>
+      <w:r>
+        <w:rPr>
+          <w:rFonts w:ascii="Consolas" w:eastAsia="Times New Roman" w:hAnsi="Consolas" w:cs="Times New Roman"/>
+          <w:color w:val="DCDCAA"/>
+          <w:kern w:val="0"/>
+          <w:sz w:val="21"/>
+          <w:szCs w:val="21"/>
+          <w:lang w:eastAsia="en-PH"/>
+          <w14:ligatures w14:val="none"/>
+        </w:rPr>
+        <w:t>tail</w:t>
+      </w:r>
+      <w:r>
+        <w:rPr>
+          <w:rFonts w:ascii="Consolas" w:eastAsia="Times New Roman" w:hAnsi="Consolas" w:cs="Times New Roman"/>
+          <w:color w:val="CCCCCC"/>
+          <w:kern w:val="0"/>
+          <w:sz w:val="21"/>
+          <w:szCs w:val="21"/>
+          <w:lang w:eastAsia="en-PH"/>
+          <w14:ligatures w14:val="none"/>
+        </w:rPr>
+        <w:t>(</w:t>
+      </w:r>
+      <w:r>
+        <w:rPr>
+          <w:rFonts w:ascii="Consolas" w:eastAsia="Times New Roman" w:hAnsi="Consolas" w:cs="Times New Roman"/>
+          <w:color w:val="B5CEA8"/>
+          <w:kern w:val="0"/>
+          <w:sz w:val="21"/>
+          <w:szCs w:val="21"/>
+          <w:lang w:eastAsia="en-PH"/>
+          <w14:ligatures w14:val="none"/>
+        </w:rPr>
+        <w:t>5</w:t>
+      </w:r>
+      <w:r>
+        <w:rPr>
+          <w:rFonts w:ascii="Consolas" w:eastAsia="Times New Roman" w:hAnsi="Consolas" w:cs="Times New Roman"/>
+          <w:color w:val="CCCCCC"/>
+          <w:kern w:val="0"/>
+          <w:sz w:val="21"/>
+          <w:szCs w:val="21"/>
+          <w:lang w:eastAsia="en-PH"/>
+          <w14:ligatures w14:val="none"/>
+        </w:rPr>
+        <w:t>)</w:t>
+      </w:r>
+    </w:p>
+    <w:p>
+      <w:pPr>
+        <w:pStyle w:val="ListParagraph"/>
+        <w:numPr>
+          <w:ilvl w:val="1"/>
+          <w:numId w:val="1"/>
+        </w:numPr>
+      </w:pPr>
+      <w:r>
+        <w:t>This code filters gender that have null values.</w:t>
+      </w:r>
+    </w:p>
+    <w:p>
+      <w:pPr>
+        <w:pStyle w:val="ListParagraph"/>
+        <w:numPr>
+          <w:ilvl w:val="1"/>
+          <w:numId w:val="1"/>
+        </w:numPr>
+      </w:pPr>
+      <w:r>
+        <w:t xml:space="preserve">FINDING: </w:t>
+      </w:r>
+      <w:r>
+        <w:t>Weird! The 118 years old was not removed.</w:t>
+      </w:r>
+    </w:p>
+    <w:p>
+      <w:pPr>
+        <w:pStyle w:val="ListParagraph"/>
+        <w:numPr>
+          <w:ilvl w:val="1"/>
+          <w:numId w:val="1"/>
+        </w:numPr>
+      </w:pPr>
+      <w:r>
+        <w:t>So there are 1135 completed offers that are not accurately registered (i.e. they are 118 years of age, no gender, and no income)</w:t>
+      </w:r>
+    </w:p>
+    <w:p>
+      <w:pPr>
+        <w:pStyle w:val="ListParagraph"/>
+        <w:numPr>
+          <w:ilvl w:val="2"/>
+          <w:numId w:val="1"/>
+        </w:numPr>
+      </w:pPr>
+      <w:r>
+        <w:t>This is a good one to implement for the company – emphasize customer database through other programs such as membership</w:t>
+      </w:r>
+    </w:p>
+    <w:p>
+      <w:pPr>
+        <w:pStyle w:val="ListParagraph"/>
+        <w:numPr>
+          <w:ilvl w:val="1"/>
+          <w:numId w:val="1"/>
+        </w:numPr>
+        <w:shd w:val="clear" w:color="auto" w:fill="1F1F1F"/>
+        <w:spacing w:after="0" w:line="285" w:lineRule="atLeast"/>
+        <w:rPr>
+          <w:rFonts w:ascii="Consolas" w:eastAsia="Times New Roman" w:hAnsi="Consolas" w:cs="Times New Roman"/>
+          <w:color w:val="CCCCCC"/>
+          <w:kern w:val="0"/>
+          <w:sz w:val="21"/>
+          <w:szCs w:val="21"/>
+          <w:lang w:eastAsia="en-PH"/>
+          <w14:ligatures w14:val="none"/>
+        </w:rPr>
+      </w:pPr>
+      <w:r>
+        <w:rPr>
+          <w:rFonts w:ascii="Consolas" w:eastAsia="Times New Roman" w:hAnsi="Consolas" w:cs="Times New Roman"/>
+          <w:color w:val="9CDCFE"/>
+          <w:kern w:val="0"/>
+          <w:sz w:val="21"/>
+          <w:szCs w:val="21"/>
+          <w:lang w:eastAsia="en-PH"/>
+          <w14:ligatures w14:val="none"/>
+        </w:rPr>
+        <w:t>filtered_completedoffers_offers_trial</w:t>
+      </w:r>
+      <w:r>
+        <w:rPr>
+          <w:rFonts w:ascii="Consolas" w:eastAsia="Times New Roman" w:hAnsi="Consolas" w:cs="Times New Roman"/>
+          <w:color w:val="CCCCCC"/>
+          <w:kern w:val="0"/>
+          <w:sz w:val="21"/>
+          <w:szCs w:val="21"/>
+          <w:lang w:eastAsia="en-PH"/>
+          <w14:ligatures w14:val="none"/>
+        </w:rPr>
+        <w:t>.</w:t>
+      </w:r>
+      <w:r>
+        <w:rPr>
+          <w:rFonts w:ascii="Consolas" w:eastAsia="Times New Roman" w:hAnsi="Consolas" w:cs="Times New Roman"/>
+          <w:color w:val="DCDCAA"/>
+          <w:kern w:val="0"/>
+          <w:sz w:val="21"/>
+          <w:szCs w:val="21"/>
+          <w:lang w:eastAsia="en-PH"/>
+          <w14:ligatures w14:val="none"/>
+        </w:rPr>
+        <w:t>drop</w:t>
+      </w:r>
+      <w:r>
+        <w:rPr>
+          <w:rFonts w:ascii="Consolas" w:eastAsia="Times New Roman" w:hAnsi="Consolas" w:cs="Times New Roman"/>
+          <w:color w:val="CCCCCC"/>
+          <w:kern w:val="0"/>
+          <w:sz w:val="21"/>
+          <w:szCs w:val="21"/>
+          <w:lang w:eastAsia="en-PH"/>
+          <w14:ligatures w14:val="none"/>
+        </w:rPr>
+        <w:t>(</w:t>
+      </w:r>
+      <w:r>
+        <w:rPr>
+          <w:rFonts w:ascii="Consolas" w:eastAsia="Times New Roman" w:hAnsi="Consolas" w:cs="Times New Roman"/>
+          <w:color w:val="9CDCFE"/>
+          <w:kern w:val="0"/>
+          <w:sz w:val="21"/>
+          <w:szCs w:val="21"/>
+          <w:lang w:eastAsia="en-PH"/>
+          <w14:ligatures w14:val="none"/>
+        </w:rPr>
+        <w:t>filtered_completedoffers_offers_trial</w:t>
+      </w:r>
+      <w:r>
+        <w:rPr>
+          <w:rFonts w:ascii="Consolas" w:eastAsia="Times New Roman" w:hAnsi="Consolas" w:cs="Times New Roman"/>
+          <w:color w:val="CCCCCC"/>
+          <w:kern w:val="0"/>
+          <w:sz w:val="21"/>
+          <w:szCs w:val="21"/>
+          <w:lang w:eastAsia="en-PH"/>
+          <w14:ligatures w14:val="none"/>
+        </w:rPr>
+        <w:t>[</w:t>
+      </w:r>
+      <w:r>
+        <w:rPr>
+          <w:rFonts w:ascii="Consolas" w:eastAsia="Times New Roman" w:hAnsi="Consolas" w:cs="Times New Roman"/>
+          <w:color w:val="9CDCFE"/>
+          <w:kern w:val="0"/>
+          <w:sz w:val="21"/>
+          <w:szCs w:val="21"/>
+          <w:lang w:eastAsia="en-PH"/>
+          <w14:ligatures w14:val="none"/>
+        </w:rPr>
+        <w:t>filtered_completedoffers_offers_trial</w:t>
+      </w:r>
+      <w:r>
+        <w:rPr>
+          <w:rFonts w:ascii="Consolas" w:eastAsia="Times New Roman" w:hAnsi="Consolas" w:cs="Times New Roman"/>
+          <w:color w:val="CCCCCC"/>
+          <w:kern w:val="0"/>
+          <w:sz w:val="21"/>
+          <w:szCs w:val="21"/>
+          <w:lang w:eastAsia="en-PH"/>
+          <w14:ligatures w14:val="none"/>
+        </w:rPr>
+        <w:t>[</w:t>
+      </w:r>
+      <w:r>
+        <w:rPr>
+          <w:rFonts w:ascii="Consolas" w:eastAsia="Times New Roman" w:hAnsi="Consolas" w:cs="Times New Roman"/>
+          <w:color w:val="CE9178"/>
+          <w:kern w:val="0"/>
+          <w:sz w:val="21"/>
+          <w:szCs w:val="21"/>
+          <w:lang w:eastAsia="en-PH"/>
+          <w14:ligatures w14:val="none"/>
+        </w:rPr>
+        <w:t>'age'</w:t>
+      </w:r>
+      <w:r>
+        <w:rPr>
+          <w:rFonts w:ascii="Consolas" w:eastAsia="Times New Roman" w:hAnsi="Consolas" w:cs="Times New Roman"/>
+          <w:color w:val="CCCCCC"/>
+          <w:kern w:val="0"/>
+          <w:sz w:val="21"/>
+          <w:szCs w:val="21"/>
+          <w:lang w:eastAsia="en-PH"/>
+          <w14:ligatures w14:val="none"/>
+        </w:rPr>
+        <w:t xml:space="preserve">] </w:t>
+      </w:r>
+      <w:r>
+        <w:rPr>
+          <w:rFonts w:ascii="Consolas" w:eastAsia="Times New Roman" w:hAnsi="Consolas" w:cs="Times New Roman"/>
+          <w:color w:val="DCDCAA"/>
+          <w:kern w:val="0"/>
+          <w:sz w:val="21"/>
+          <w:szCs w:val="21"/>
+          <w:lang w:eastAsia="en-PH"/>
+          <w14:ligatures w14:val="none"/>
+        </w:rPr>
+        <w:t>&gt;</w:t>
+      </w:r>
+      <w:r>
+        <w:rPr>
+          <w:rFonts w:ascii="Consolas" w:eastAsia="Times New Roman" w:hAnsi="Consolas" w:cs="Times New Roman"/>
+          <w:color w:val="CCCCCC"/>
+          <w:kern w:val="0"/>
+          <w:sz w:val="21"/>
+          <w:szCs w:val="21"/>
+          <w:lang w:eastAsia="en-PH"/>
+          <w14:ligatures w14:val="none"/>
+        </w:rPr>
+        <w:t xml:space="preserve"> </w:t>
+      </w:r>
+      <w:r>
+        <w:rPr>
+          <w:rFonts w:ascii="Consolas" w:eastAsia="Times New Roman" w:hAnsi="Consolas" w:cs="Times New Roman"/>
+          <w:color w:val="B5CEA8"/>
+          <w:kern w:val="0"/>
+          <w:sz w:val="21"/>
+          <w:szCs w:val="21"/>
+          <w:lang w:eastAsia="en-PH"/>
+          <w14:ligatures w14:val="none"/>
+        </w:rPr>
+        <w:t>110</w:t>
+      </w:r>
+      <w:r>
+        <w:rPr>
+          <w:rFonts w:ascii="Consolas" w:eastAsia="Times New Roman" w:hAnsi="Consolas" w:cs="Times New Roman"/>
+          <w:color w:val="CCCCCC"/>
+          <w:kern w:val="0"/>
+          <w:sz w:val="21"/>
+          <w:szCs w:val="21"/>
+          <w:lang w:eastAsia="en-PH"/>
+          <w14:ligatures w14:val="none"/>
+        </w:rPr>
+        <w:t>].</w:t>
+      </w:r>
+      <w:r>
+        <w:rPr>
+          <w:rFonts w:ascii="Consolas" w:eastAsia="Times New Roman" w:hAnsi="Consolas" w:cs="Times New Roman"/>
+          <w:color w:val="9CDCFE"/>
+          <w:kern w:val="0"/>
+          <w:sz w:val="21"/>
+          <w:szCs w:val="21"/>
+          <w:lang w:eastAsia="en-PH"/>
+          <w14:ligatures w14:val="none"/>
+        </w:rPr>
+        <w:t>index</w:t>
+      </w:r>
+      <w:r>
+        <w:rPr>
+          <w:rFonts w:ascii="Consolas" w:eastAsia="Times New Roman" w:hAnsi="Consolas" w:cs="Times New Roman"/>
+          <w:color w:val="CCCCCC"/>
+          <w:kern w:val="0"/>
+          <w:sz w:val="21"/>
+          <w:szCs w:val="21"/>
+          <w:lang w:eastAsia="en-PH"/>
+          <w14:ligatures w14:val="none"/>
+        </w:rPr>
+        <w:t xml:space="preserve">, </w:t>
+      </w:r>
+      <w:r>
+        <w:rPr>
+          <w:rFonts w:ascii="Consolas" w:eastAsia="Times New Roman" w:hAnsi="Consolas" w:cs="Times New Roman"/>
+          <w:color w:val="9CDCFE"/>
+          <w:kern w:val="0"/>
+          <w:sz w:val="21"/>
+          <w:szCs w:val="21"/>
+          <w:lang w:eastAsia="en-PH"/>
+          <w14:ligatures w14:val="none"/>
+        </w:rPr>
+        <w:t>inplace</w:t>
+      </w:r>
+      <w:r>
+        <w:rPr>
+          <w:rFonts w:ascii="Consolas" w:eastAsia="Times New Roman" w:hAnsi="Consolas" w:cs="Times New Roman"/>
+          <w:color w:val="CCCCCC"/>
+          <w:kern w:val="0"/>
+          <w:sz w:val="21"/>
+          <w:szCs w:val="21"/>
+          <w:lang w:eastAsia="en-PH"/>
+          <w14:ligatures w14:val="none"/>
+        </w:rPr>
+        <w:t xml:space="preserve"> </w:t>
+      </w:r>
+      <w:r>
+        <w:rPr>
+          <w:rFonts w:ascii="Consolas" w:eastAsia="Times New Roman" w:hAnsi="Consolas" w:cs="Times New Roman"/>
+          <w:color w:val="D4D4D4"/>
+          <w:kern w:val="0"/>
+          <w:sz w:val="21"/>
+          <w:szCs w:val="21"/>
+          <w:lang w:eastAsia="en-PH"/>
+          <w14:ligatures w14:val="none"/>
+        </w:rPr>
+        <w:t>=</w:t>
+      </w:r>
+      <w:r>
+        <w:rPr>
+          <w:rFonts w:ascii="Consolas" w:eastAsia="Times New Roman" w:hAnsi="Consolas" w:cs="Times New Roman"/>
+          <w:color w:val="CCCCCC"/>
+          <w:kern w:val="0"/>
+          <w:sz w:val="21"/>
+          <w:szCs w:val="21"/>
+          <w:lang w:eastAsia="en-PH"/>
+          <w14:ligatures w14:val="none"/>
+        </w:rPr>
+        <w:t xml:space="preserve"> </w:t>
+      </w:r>
+      <w:r>
+        <w:rPr>
+          <w:rFonts w:ascii="Consolas" w:eastAsia="Times New Roman" w:hAnsi="Consolas" w:cs="Times New Roman"/>
+          <w:color w:val="569CD6"/>
+          <w:kern w:val="0"/>
+          <w:sz w:val="21"/>
+          <w:szCs w:val="21"/>
+          <w:lang w:eastAsia="en-PH"/>
+          <w14:ligatures w14:val="none"/>
+        </w:rPr>
+        <w:t>True</w:t>
+      </w:r>
+      <w:r>
+        <w:rPr>
+          <w:rFonts w:ascii="Consolas" w:eastAsia="Times New Roman" w:hAnsi="Consolas" w:cs="Times New Roman"/>
+          <w:color w:val="CCCCCC"/>
+          <w:kern w:val="0"/>
+          <w:sz w:val="21"/>
+          <w:szCs w:val="21"/>
+          <w:lang w:eastAsia="en-PH"/>
+          <w14:ligatures w14:val="none"/>
+        </w:rPr>
+        <w:t>)</w:t>
+      </w:r>
+    </w:p>
+    <w:p>
+      <w:pPr>
+        <w:pStyle w:val="ListParagraph"/>
+        <w:numPr>
+          <w:ilvl w:val="2"/>
+          <w:numId w:val="1"/>
+        </w:numPr>
+      </w:pPr>
+      <w:r>
+        <w:t>After doing this,</w:t>
+      </w:r>
+    </w:p>
+    <w:p>
+      <w:pPr>
+        <w:pStyle w:val="ListParagraph"/>
+        <w:numPr>
+          <w:ilvl w:val="2"/>
+          <w:numId w:val="1"/>
+        </w:numPr>
+      </w:pPr>
+      <w:r>
+        <w:t>Gender, age, and income match with customer id with 32444 non null values</w:t>
+      </w:r>
+    </w:p>
+    <w:p>
+      <w:pPr>
+        <w:pStyle w:val="ListParagraph"/>
+        <w:numPr>
+          <w:ilvl w:val="2"/>
+          <w:numId w:val="1"/>
+        </w:numPr>
+      </w:pPr>
+      <w:r>
+        <w:t>Transactbeforeoffer goes down to 29581</w:t>
+      </w:r>
+    </w:p>
+    <w:p>
+      <w:pPr>
+        <w:pStyle w:val="ListParagraph"/>
+        <w:numPr>
+          <w:ilvl w:val="2"/>
+          <w:numId w:val="1"/>
+        </w:numPr>
+      </w:pPr>
+      <w:r>
+        <w:lastRenderedPageBreak/>
+        <w:t xml:space="preserve">Recall that there should be 2962 completed offers that do not have transactions, suggesting multiple offers claimed for one transaction. </w:t>
+      </w:r>
+    </w:p>
+    <w:p>
+      <w:pPr>
+        <w:pStyle w:val="ListParagraph"/>
+        <w:numPr>
+          <w:ilvl w:val="2"/>
+          <w:numId w:val="1"/>
+        </w:numPr>
+      </w:pPr>
+      <w:r>
+        <w:t>Now, 32444-29581 = 2863.</w:t>
+      </w:r>
+    </w:p>
+    <w:p>
+      <w:pPr>
+        <w:pStyle w:val="ListParagraph"/>
+        <w:numPr>
+          <w:ilvl w:val="3"/>
+          <w:numId w:val="1"/>
+        </w:numPr>
+      </w:pPr>
+      <w:r>
+        <w:t>This means that in the Excel spreadsheet, there are (2962 – 2863) 99 people with incomplete information (i.e. above 110 years, no gender, no income)</w:t>
+      </w:r>
+    </w:p>
+    <w:p>
+      <w:pPr>
+        <w:pStyle w:val="ListParagraph"/>
+        <w:numPr>
+          <w:ilvl w:val="1"/>
+          <w:numId w:val="1"/>
+        </w:numPr>
+        <w:shd w:val="clear" w:color="auto" w:fill="1F1F1F"/>
+        <w:spacing w:after="0" w:line="285" w:lineRule="atLeast"/>
+        <w:rPr>
+          <w:rFonts w:ascii="Consolas" w:eastAsia="Times New Roman" w:hAnsi="Consolas" w:cs="Times New Roman"/>
+          <w:color w:val="CCCCCC"/>
+          <w:kern w:val="0"/>
+          <w:sz w:val="21"/>
+          <w:szCs w:val="21"/>
+          <w:lang w:eastAsia="en-PH"/>
+          <w14:ligatures w14:val="none"/>
+        </w:rPr>
+      </w:pPr>
+      <w:r>
+        <w:rPr>
+          <w:rFonts w:ascii="Consolas" w:eastAsia="Times New Roman" w:hAnsi="Consolas" w:cs="Times New Roman"/>
+          <w:color w:val="9CDCFE"/>
+          <w:kern w:val="0"/>
+          <w:sz w:val="21"/>
+          <w:szCs w:val="21"/>
+          <w:lang w:eastAsia="en-PH"/>
+          <w14:ligatures w14:val="none"/>
+        </w:rPr>
+        <w:t>filtered_completedoffers_offers_trial</w:t>
+      </w:r>
+      <w:r>
+        <w:rPr>
+          <w:rFonts w:ascii="Consolas" w:eastAsia="Times New Roman" w:hAnsi="Consolas" w:cs="Times New Roman"/>
+          <w:color w:val="CCCCCC"/>
+          <w:kern w:val="0"/>
+          <w:sz w:val="21"/>
+          <w:szCs w:val="21"/>
+          <w:lang w:eastAsia="en-PH"/>
+          <w14:ligatures w14:val="none"/>
+        </w:rPr>
+        <w:t>.</w:t>
+      </w:r>
+      <w:r>
+        <w:rPr>
+          <w:rFonts w:ascii="Consolas" w:eastAsia="Times New Roman" w:hAnsi="Consolas" w:cs="Times New Roman"/>
+          <w:color w:val="DCDCAA"/>
+          <w:kern w:val="0"/>
+          <w:sz w:val="21"/>
+          <w:szCs w:val="21"/>
+          <w:lang w:eastAsia="en-PH"/>
+          <w14:ligatures w14:val="none"/>
+        </w:rPr>
+        <w:t>isna</w:t>
+      </w:r>
+      <w:r>
+        <w:rPr>
+          <w:rFonts w:ascii="Consolas" w:eastAsia="Times New Roman" w:hAnsi="Consolas" w:cs="Times New Roman"/>
+          <w:color w:val="CCCCCC"/>
+          <w:kern w:val="0"/>
+          <w:sz w:val="21"/>
+          <w:szCs w:val="21"/>
+          <w:lang w:eastAsia="en-PH"/>
+          <w14:ligatures w14:val="none"/>
+        </w:rPr>
+        <w:t>().</w:t>
+      </w:r>
+      <w:r>
+        <w:rPr>
+          <w:rFonts w:ascii="Consolas" w:eastAsia="Times New Roman" w:hAnsi="Consolas" w:cs="Times New Roman"/>
+          <w:color w:val="DCDCAA"/>
+          <w:kern w:val="0"/>
+          <w:sz w:val="21"/>
+          <w:szCs w:val="21"/>
+          <w:lang w:eastAsia="en-PH"/>
+          <w14:ligatures w14:val="none"/>
+        </w:rPr>
+        <w:t>sum</w:t>
+      </w:r>
+      <w:r>
+        <w:rPr>
+          <w:rFonts w:ascii="Consolas" w:eastAsia="Times New Roman" w:hAnsi="Consolas" w:cs="Times New Roman"/>
+          <w:color w:val="CCCCCC"/>
+          <w:kern w:val="0"/>
+          <w:sz w:val="21"/>
+          <w:szCs w:val="21"/>
+          <w:lang w:eastAsia="en-PH"/>
+          <w14:ligatures w14:val="none"/>
+        </w:rPr>
+        <w:t>()</w:t>
+      </w:r>
+    </w:p>
+    <w:p>
+      <w:pPr>
+        <w:pStyle w:val="ListParagraph"/>
+        <w:numPr>
+          <w:ilvl w:val="2"/>
+          <w:numId w:val="1"/>
+        </w:numPr>
+      </w:pPr>
+      <w:r>
+        <w:t>There are 32444 null values under amount. This makes sense because the dataframe is filtered to reflect completed offers only. Amount is from ‘transaction’ event.</w:t>
+      </w:r>
+    </w:p>
+    <w:p>
+      <w:pPr>
+        <w:pStyle w:val="ListParagraph"/>
+        <w:numPr>
+          <w:ilvl w:val="1"/>
+          <w:numId w:val="1"/>
+        </w:numPr>
+        <w:shd w:val="clear" w:color="auto" w:fill="1F1F1F"/>
+        <w:spacing w:after="0" w:line="285" w:lineRule="atLeast"/>
+        <w:rPr>
+          <w:rFonts w:ascii="Consolas" w:eastAsia="Times New Roman" w:hAnsi="Consolas" w:cs="Times New Roman"/>
+          <w:color w:val="CCCCCC"/>
+          <w:kern w:val="0"/>
+          <w:sz w:val="21"/>
+          <w:szCs w:val="21"/>
+          <w:lang w:eastAsia="en-PH"/>
+          <w14:ligatures w14:val="none"/>
+        </w:rPr>
+      </w:pPr>
+      <w:r>
+        <w:rPr>
+          <w:rFonts w:ascii="Consolas" w:eastAsia="Times New Roman" w:hAnsi="Consolas" w:cs="Times New Roman"/>
+          <w:color w:val="9CDCFE"/>
+          <w:kern w:val="0"/>
+          <w:sz w:val="21"/>
+          <w:szCs w:val="21"/>
+          <w:lang w:eastAsia="en-PH"/>
+          <w14:ligatures w14:val="none"/>
+        </w:rPr>
+        <w:t>df_null_transact</w:t>
+      </w:r>
+      <w:r>
+        <w:rPr>
+          <w:rFonts w:ascii="Consolas" w:eastAsia="Times New Roman" w:hAnsi="Consolas" w:cs="Times New Roman"/>
+          <w:color w:val="CCCCCC"/>
+          <w:kern w:val="0"/>
+          <w:sz w:val="21"/>
+          <w:szCs w:val="21"/>
+          <w:lang w:eastAsia="en-PH"/>
+          <w14:ligatures w14:val="none"/>
+        </w:rPr>
+        <w:t xml:space="preserve"> </w:t>
+      </w:r>
+      <w:r>
+        <w:rPr>
+          <w:rFonts w:ascii="Consolas" w:eastAsia="Times New Roman" w:hAnsi="Consolas" w:cs="Times New Roman"/>
+          <w:color w:val="D4D4D4"/>
+          <w:kern w:val="0"/>
+          <w:sz w:val="21"/>
+          <w:szCs w:val="21"/>
+          <w:lang w:eastAsia="en-PH"/>
+          <w14:ligatures w14:val="none"/>
+        </w:rPr>
+        <w:t>=</w:t>
+      </w:r>
+      <w:r>
+        <w:rPr>
+          <w:rFonts w:ascii="Consolas" w:eastAsia="Times New Roman" w:hAnsi="Consolas" w:cs="Times New Roman"/>
+          <w:color w:val="CCCCCC"/>
+          <w:kern w:val="0"/>
+          <w:sz w:val="21"/>
+          <w:szCs w:val="21"/>
+          <w:lang w:eastAsia="en-PH"/>
+          <w14:ligatures w14:val="none"/>
+        </w:rPr>
+        <w:t xml:space="preserve"> </w:t>
+      </w:r>
+      <w:r>
+        <w:rPr>
+          <w:rFonts w:ascii="Consolas" w:eastAsia="Times New Roman" w:hAnsi="Consolas" w:cs="Times New Roman"/>
+          <w:color w:val="9CDCFE"/>
+          <w:kern w:val="0"/>
+          <w:sz w:val="21"/>
+          <w:szCs w:val="21"/>
+          <w:lang w:eastAsia="en-PH"/>
+          <w14:ligatures w14:val="none"/>
+        </w:rPr>
+        <w:t>filtered_completedoffers_offers_trial</w:t>
+      </w:r>
+      <w:r>
+        <w:rPr>
+          <w:rFonts w:ascii="Consolas" w:eastAsia="Times New Roman" w:hAnsi="Consolas" w:cs="Times New Roman"/>
+          <w:color w:val="CCCCCC"/>
+          <w:kern w:val="0"/>
+          <w:sz w:val="21"/>
+          <w:szCs w:val="21"/>
+          <w:lang w:eastAsia="en-PH"/>
+          <w14:ligatures w14:val="none"/>
+        </w:rPr>
+        <w:t>[</w:t>
+      </w:r>
+      <w:r>
+        <w:rPr>
+          <w:rFonts w:ascii="Consolas" w:eastAsia="Times New Roman" w:hAnsi="Consolas" w:cs="Times New Roman"/>
+          <w:color w:val="9CDCFE"/>
+          <w:kern w:val="0"/>
+          <w:sz w:val="21"/>
+          <w:szCs w:val="21"/>
+          <w:lang w:eastAsia="en-PH"/>
+          <w14:ligatures w14:val="none"/>
+        </w:rPr>
+        <w:t>filtered_completedoffers_offers_trial</w:t>
+      </w:r>
+      <w:r>
+        <w:rPr>
+          <w:rFonts w:ascii="Consolas" w:eastAsia="Times New Roman" w:hAnsi="Consolas" w:cs="Times New Roman"/>
+          <w:color w:val="CCCCCC"/>
+          <w:kern w:val="0"/>
+          <w:sz w:val="21"/>
+          <w:szCs w:val="21"/>
+          <w:lang w:eastAsia="en-PH"/>
+          <w14:ligatures w14:val="none"/>
+        </w:rPr>
+        <w:t>[</w:t>
+      </w:r>
+      <w:r>
+        <w:rPr>
+          <w:rFonts w:ascii="Consolas" w:eastAsia="Times New Roman" w:hAnsi="Consolas" w:cs="Times New Roman"/>
+          <w:color w:val="CE9178"/>
+          <w:kern w:val="0"/>
+          <w:sz w:val="21"/>
+          <w:szCs w:val="21"/>
+          <w:lang w:eastAsia="en-PH"/>
+          <w14:ligatures w14:val="none"/>
+        </w:rPr>
+        <w:t>'transactbeforeoffer'</w:t>
+      </w:r>
+      <w:r>
+        <w:rPr>
+          <w:rFonts w:ascii="Consolas" w:eastAsia="Times New Roman" w:hAnsi="Consolas" w:cs="Times New Roman"/>
+          <w:color w:val="CCCCCC"/>
+          <w:kern w:val="0"/>
+          <w:sz w:val="21"/>
+          <w:szCs w:val="21"/>
+          <w:lang w:eastAsia="en-PH"/>
+          <w14:ligatures w14:val="none"/>
+        </w:rPr>
+        <w:t>].</w:t>
+      </w:r>
+      <w:r>
+        <w:rPr>
+          <w:rFonts w:ascii="Consolas" w:eastAsia="Times New Roman" w:hAnsi="Consolas" w:cs="Times New Roman"/>
+          <w:color w:val="DCDCAA"/>
+          <w:kern w:val="0"/>
+          <w:sz w:val="21"/>
+          <w:szCs w:val="21"/>
+          <w:lang w:eastAsia="en-PH"/>
+          <w14:ligatures w14:val="none"/>
+        </w:rPr>
+        <w:t>isnull</w:t>
+      </w:r>
+      <w:r>
+        <w:rPr>
+          <w:rFonts w:ascii="Consolas" w:eastAsia="Times New Roman" w:hAnsi="Consolas" w:cs="Times New Roman"/>
+          <w:color w:val="CCCCCC"/>
+          <w:kern w:val="0"/>
+          <w:sz w:val="21"/>
+          <w:szCs w:val="21"/>
+          <w:lang w:eastAsia="en-PH"/>
+          <w14:ligatures w14:val="none"/>
+        </w:rPr>
+        <w:t>()]</w:t>
+      </w:r>
+    </w:p>
+    <w:p>
+      <w:pPr>
+        <w:pStyle w:val="ListParagraph"/>
+        <w:numPr>
+          <w:ilvl w:val="2"/>
+          <w:numId w:val="1"/>
+        </w:numPr>
+      </w:pPr>
+      <w:r>
+        <w:t>I now have a variable df_null_transact that collected all rows with two, three, or four simultaneous completed offers after one transaction only.</w:t>
+      </w:r>
+    </w:p>
+    <w:p>
+      <w:pPr>
+        <w:pStyle w:val="ListParagraph"/>
+        <w:numPr>
+          <w:ilvl w:val="2"/>
+          <w:numId w:val="1"/>
+        </w:numPr>
+      </w:pPr>
+      <w:r>
+        <w:t>But recall this is from events_cust_merged</w:t>
+      </w:r>
+    </w:p>
+    <w:p>
+      <w:pPr>
+        <w:pStyle w:val="ListParagraph"/>
+        <w:numPr>
+          <w:ilvl w:val="3"/>
+          <w:numId w:val="1"/>
+        </w:numPr>
+      </w:pPr>
+      <w:r>
+        <w:t>Comparing the info() of events_cust_merged vs all_merged_final</w:t>
+      </w:r>
+    </w:p>
+    <w:p>
+      <w:pPr>
+        <w:pStyle w:val="ListParagraph"/>
+        <w:numPr>
+          <w:ilvl w:val="4"/>
+          <w:numId w:val="1"/>
+        </w:numPr>
+      </w:pPr>
+      <w:r>
+        <w:t>28 rows vs 29 rows</w:t>
+      </w:r>
+    </w:p>
+    <w:p>
+      <w:pPr>
+        <w:pStyle w:val="ListParagraph"/>
+        <w:numPr>
+          <w:ilvl w:val="3"/>
+          <w:numId w:val="1"/>
+        </w:numPr>
+      </w:pPr>
+      <w:r>
+        <w:t>Comparing the info() of events_cust_merged vs all_merged_</w:t>
+      </w:r>
+      <w:r>
+        <w:t>no118</w:t>
+      </w:r>
+    </w:p>
+    <w:p>
+      <w:pPr>
+        <w:pStyle w:val="ListParagraph"/>
+        <w:numPr>
+          <w:ilvl w:val="4"/>
+          <w:numId w:val="1"/>
+        </w:numPr>
+      </w:pPr>
+      <w:r>
+        <w:t>28 rows vs 29 rows</w:t>
+      </w:r>
+    </w:p>
+    <w:p>
+      <w:pPr>
+        <w:pStyle w:val="ListParagraph"/>
+        <w:numPr>
+          <w:ilvl w:val="4"/>
+          <w:numId w:val="1"/>
+        </w:numPr>
+      </w:pPr>
+      <w:r>
+        <w:rPr>
+          <w:highlight w:val="yellow"/>
+        </w:rPr>
+        <w:t>'customer_id', 'event'</w:t>
+      </w:r>
+      <w:r>
+        <w:t xml:space="preserve">, </w:t>
+      </w:r>
+      <w:r>
+        <w:rPr>
+          <w:highlight w:val="yellow"/>
+        </w:rPr>
+        <w:t>'time', 'offer id'</w:t>
+      </w:r>
+      <w:r>
+        <w:t xml:space="preserve">, </w:t>
+      </w:r>
+      <w:r>
+        <w:rPr>
+          <w:highlight w:val="yellow"/>
+        </w:rPr>
+        <w:t>'amount',</w:t>
+      </w:r>
+      <w:r>
+        <w:t xml:space="preserve"> 'offer_id',</w:t>
+      </w:r>
+    </w:p>
+    <w:p>
+      <w:pPr>
+        <w:pStyle w:val="ListParagraph"/>
+        <w:numPr>
+          <w:ilvl w:val="4"/>
+          <w:numId w:val="1"/>
+        </w:numPr>
+        <w:rPr>
+          <w:highlight w:val="yellow"/>
+        </w:rPr>
+      </w:pPr>
+      <w:r>
+        <w:t xml:space="preserve">       </w:t>
+      </w:r>
+      <w:r>
+        <w:rPr>
+          <w:highlight w:val="yellow"/>
+        </w:rPr>
+        <w:t>'given reward', 'transactbeforeoffer'</w:t>
+      </w:r>
+      <w:r>
+        <w:t xml:space="preserve">, </w:t>
+      </w:r>
+      <w:r>
+        <w:rPr>
+          <w:highlight w:val="yellow"/>
+        </w:rPr>
+        <w:t>'time(days)', 'rounded day',</w:t>
+      </w:r>
+    </w:p>
+    <w:p>
+      <w:pPr>
+        <w:pStyle w:val="ListParagraph"/>
+        <w:numPr>
+          <w:ilvl w:val="4"/>
+          <w:numId w:val="1"/>
+        </w:numPr>
+        <w:rPr>
+          <w:highlight w:val="yellow"/>
+        </w:rPr>
+      </w:pPr>
+      <w:r>
+        <w:rPr>
+          <w:highlight w:val="yellow"/>
+        </w:rPr>
+        <w:t xml:space="preserve">       'became_member_on', 'gender', 'age',</w:t>
+      </w:r>
+      <w:r>
+        <w:t xml:space="preserve"> </w:t>
+      </w:r>
+      <w:r>
+        <w:rPr>
+          <w:highlight w:val="yellow"/>
+        </w:rPr>
+        <w:t>'income', 'date', 'year', 'month',</w:t>
+      </w:r>
+    </w:p>
+    <w:p>
+      <w:pPr>
+        <w:pStyle w:val="ListParagraph"/>
+        <w:numPr>
+          <w:ilvl w:val="4"/>
+          <w:numId w:val="1"/>
+        </w:numPr>
+        <w:rPr>
+          <w:highlight w:val="yellow"/>
+        </w:rPr>
+      </w:pPr>
+      <w:r>
+        <w:t xml:space="preserve">       </w:t>
+      </w:r>
+      <w:r>
+        <w:rPr>
+          <w:highlight w:val="yellow"/>
+        </w:rPr>
+        <w:t>'offer_type'</w:t>
+      </w:r>
+      <w:r>
+        <w:t xml:space="preserve">, </w:t>
+      </w:r>
+      <w:r>
+        <w:rPr>
+          <w:highlight w:val="yellow"/>
+        </w:rPr>
+        <w:t>'difficulty', 'assoc. reward', 'duration', 'channels',</w:t>
+      </w:r>
+    </w:p>
+    <w:p>
+      <w:pPr>
+        <w:pStyle w:val="ListParagraph"/>
+        <w:numPr>
+          <w:ilvl w:val="4"/>
+          <w:numId w:val="1"/>
+        </w:numPr>
+        <w:rPr>
+          <w:highlight w:val="yellow"/>
+        </w:rPr>
+      </w:pPr>
+      <w:r>
+        <w:rPr>
+          <w:highlight w:val="yellow"/>
+        </w:rPr>
+        <w:t xml:space="preserve">       'complete offer',</w:t>
+      </w:r>
+      <w:r>
+        <w:t xml:space="preserve"> </w:t>
+      </w:r>
+      <w:r>
+        <w:rPr>
+          <w:highlight w:val="yellow"/>
+        </w:rPr>
+        <w:t>'channel 1', 'channel 2', 'channel 3', 'channel 4',</w:t>
+      </w:r>
+    </w:p>
+    <w:p>
+      <w:pPr>
+        <w:pStyle w:val="ListParagraph"/>
+        <w:numPr>
+          <w:ilvl w:val="4"/>
+          <w:numId w:val="1"/>
+        </w:numPr>
+      </w:pPr>
+      <w:r>
+        <w:rPr>
+          <w:highlight w:val="yellow"/>
+        </w:rPr>
+        <w:t xml:space="preserve">       'helper (social</w:t>
+      </w:r>
+      <w:r>
+        <w:t>)'</w:t>
+      </w:r>
+    </w:p>
+    <w:p>
+      <w:pPr>
+        <w:pStyle w:val="ListParagraph"/>
+        <w:numPr>
+          <w:ilvl w:val="4"/>
+          <w:numId w:val="1"/>
+        </w:numPr>
+      </w:pPr>
+      <w:r>
+        <w:rPr>
+          <w:highlight w:val="yellow"/>
+        </w:rPr>
+        <w:t>'customer_id', 'event'</w:t>
+      </w:r>
+      <w:r>
+        <w:t xml:space="preserve">, </w:t>
+      </w:r>
+      <w:r>
+        <w:rPr>
+          <w:highlight w:val="yellow"/>
+        </w:rPr>
+        <w:t>'time', 'offer id'</w:t>
+      </w:r>
+      <w:r>
+        <w:t xml:space="preserve">, </w:t>
+      </w:r>
+      <w:r>
+        <w:rPr>
+          <w:highlight w:val="yellow"/>
+        </w:rPr>
+        <w:t>'amount'</w:t>
+      </w:r>
+      <w:r>
+        <w:t>,</w:t>
+      </w:r>
+    </w:p>
+    <w:p>
+      <w:pPr>
+        <w:pStyle w:val="ListParagraph"/>
+        <w:numPr>
+          <w:ilvl w:val="4"/>
+          <w:numId w:val="1"/>
+        </w:numPr>
+      </w:pPr>
+      <w:r>
+        <w:t xml:space="preserve">       'completed offer id', </w:t>
+      </w:r>
+      <w:r>
+        <w:rPr>
+          <w:highlight w:val="yellow"/>
+        </w:rPr>
+        <w:t>'given</w:t>
+      </w:r>
+      <w:r>
+        <w:t xml:space="preserve"> </w:t>
+      </w:r>
+      <w:r>
+        <w:rPr>
+          <w:highlight w:val="yellow"/>
+        </w:rPr>
+        <w:t>reward'</w:t>
+      </w:r>
+      <w:r>
+        <w:t xml:space="preserve">, </w:t>
+      </w:r>
+      <w:r>
+        <w:rPr>
+          <w:highlight w:val="yellow"/>
+        </w:rPr>
+        <w:t>'transactbeforeoffer'</w:t>
+      </w:r>
+      <w:r>
+        <w:t>,</w:t>
+      </w:r>
+    </w:p>
+    <w:p>
+      <w:pPr>
+        <w:pStyle w:val="ListParagraph"/>
+        <w:numPr>
+          <w:ilvl w:val="4"/>
+          <w:numId w:val="1"/>
+        </w:numPr>
+        <w:rPr>
+          <w:highlight w:val="yellow"/>
+        </w:rPr>
+      </w:pPr>
+      <w:r>
+        <w:t xml:space="preserve">       </w:t>
+      </w:r>
+      <w:r>
+        <w:rPr>
+          <w:highlight w:val="yellow"/>
+        </w:rPr>
+        <w:t>'time(days)', 'rounded day', 'became_member_on', 'gender', 'age',</w:t>
+      </w:r>
+    </w:p>
+    <w:p>
+      <w:pPr>
+        <w:pStyle w:val="ListParagraph"/>
+        <w:numPr>
+          <w:ilvl w:val="4"/>
+          <w:numId w:val="1"/>
+        </w:numPr>
+      </w:pPr>
+      <w:r>
+        <w:lastRenderedPageBreak/>
+        <w:t xml:space="preserve">       </w:t>
+      </w:r>
+      <w:r>
+        <w:rPr>
+          <w:highlight w:val="yellow"/>
+        </w:rPr>
+        <w:t>'income', 'date', 'year', 'month'</w:t>
+      </w:r>
+      <w:r>
+        <w:t xml:space="preserve">, 'offer_id_y', </w:t>
+      </w:r>
+      <w:r>
+        <w:rPr>
+          <w:highlight w:val="yellow"/>
+        </w:rPr>
+        <w:t>'offer_type'</w:t>
+      </w:r>
+      <w:r>
+        <w:t>,</w:t>
+      </w:r>
+    </w:p>
+    <w:p>
+      <w:pPr>
+        <w:pStyle w:val="ListParagraph"/>
+        <w:numPr>
+          <w:ilvl w:val="4"/>
+          <w:numId w:val="1"/>
+        </w:numPr>
+      </w:pPr>
+      <w:r>
+        <w:t xml:space="preserve">       </w:t>
+      </w:r>
+      <w:r>
+        <w:rPr>
+          <w:highlight w:val="yellow"/>
+        </w:rPr>
+        <w:t>'difficulty', 'assoc. reward', 'duration', 'channels', 'complete offer'</w:t>
+      </w:r>
+      <w:r>
+        <w:t>,</w:t>
+      </w:r>
+    </w:p>
+    <w:p>
+      <w:pPr>
+        <w:pStyle w:val="ListParagraph"/>
+        <w:numPr>
+          <w:ilvl w:val="4"/>
+          <w:numId w:val="1"/>
+        </w:numPr>
+      </w:pPr>
+      <w:r>
+        <w:t xml:space="preserve">       </w:t>
+      </w:r>
+      <w:r>
+        <w:rPr>
+          <w:highlight w:val="yellow"/>
+        </w:rPr>
+        <w:t>'channel 1', 'channel 2', 'channel 3', 'channel 4', 'helper (social</w:t>
+      </w:r>
+      <w:r>
+        <w:t>)'</w:t>
+      </w:r>
+    </w:p>
+    <w:p>
+      <w:pPr>
+        <w:pStyle w:val="ListParagraph"/>
+        <w:numPr>
+          <w:ilvl w:val="3"/>
+          <w:numId w:val="1"/>
+        </w:numPr>
+      </w:pPr>
+      <w:r>
+        <w:t>All_merged_no118 has this offer_id_y</w:t>
+      </w:r>
+    </w:p>
+    <w:p>
+      <w:pPr>
+        <w:pStyle w:val="ListParagraph"/>
+        <w:numPr>
+          <w:ilvl w:val="4"/>
+          <w:numId w:val="1"/>
+        </w:numPr>
+      </w:pPr>
+      <w:r>
+        <w:t>Happened when merging events_cust_merged with offers_trial</w:t>
+      </w:r>
+    </w:p>
+    <w:p>
+      <w:pPr>
+        <w:pStyle w:val="ListParagraph"/>
+        <w:numPr>
+          <w:ilvl w:val="4"/>
+          <w:numId w:val="1"/>
+        </w:numPr>
+        <w:shd w:val="clear" w:color="auto" w:fill="1F1F1F"/>
+        <w:spacing w:after="0" w:line="285" w:lineRule="atLeast"/>
+        <w:rPr>
+          <w:rFonts w:ascii="Consolas" w:eastAsia="Times New Roman" w:hAnsi="Consolas" w:cs="Times New Roman"/>
+          <w:color w:val="CCCCCC"/>
+          <w:kern w:val="0"/>
+          <w:sz w:val="21"/>
+          <w:szCs w:val="21"/>
+          <w:lang w:eastAsia="en-PH"/>
+          <w14:ligatures w14:val="none"/>
+        </w:rPr>
+      </w:pPr>
+      <w:r>
+        <w:rPr>
+          <w:rFonts w:ascii="Consolas" w:eastAsia="Times New Roman" w:hAnsi="Consolas" w:cs="Times New Roman"/>
+          <w:color w:val="9CDCFE"/>
+          <w:kern w:val="0"/>
+          <w:sz w:val="21"/>
+          <w:szCs w:val="21"/>
+          <w:lang w:eastAsia="en-PH"/>
+          <w14:ligatures w14:val="none"/>
+        </w:rPr>
+        <w:t>all_merged</w:t>
+      </w:r>
+      <w:r>
+        <w:rPr>
+          <w:rFonts w:ascii="Consolas" w:eastAsia="Times New Roman" w:hAnsi="Consolas" w:cs="Times New Roman"/>
+          <w:color w:val="CCCCCC"/>
+          <w:kern w:val="0"/>
+          <w:sz w:val="21"/>
+          <w:szCs w:val="21"/>
+          <w:lang w:eastAsia="en-PH"/>
+          <w14:ligatures w14:val="none"/>
+        </w:rPr>
+        <w:t xml:space="preserve"> </w:t>
+      </w:r>
+      <w:r>
+        <w:rPr>
+          <w:rFonts w:ascii="Consolas" w:eastAsia="Times New Roman" w:hAnsi="Consolas" w:cs="Times New Roman"/>
+          <w:color w:val="D4D4D4"/>
+          <w:kern w:val="0"/>
+          <w:sz w:val="21"/>
+          <w:szCs w:val="21"/>
+          <w:lang w:eastAsia="en-PH"/>
+          <w14:ligatures w14:val="none"/>
+        </w:rPr>
+        <w:t>=</w:t>
+      </w:r>
+      <w:r>
+        <w:rPr>
+          <w:rFonts w:ascii="Consolas" w:eastAsia="Times New Roman" w:hAnsi="Consolas" w:cs="Times New Roman"/>
+          <w:color w:val="CCCCCC"/>
+          <w:kern w:val="0"/>
+          <w:sz w:val="21"/>
+          <w:szCs w:val="21"/>
+          <w:lang w:eastAsia="en-PH"/>
+          <w14:ligatures w14:val="none"/>
+        </w:rPr>
+        <w:t xml:space="preserve"> </w:t>
+      </w:r>
+      <w:r>
+        <w:rPr>
+          <w:rFonts w:ascii="Consolas" w:eastAsia="Times New Roman" w:hAnsi="Consolas" w:cs="Times New Roman"/>
+          <w:color w:val="9CDCFE"/>
+          <w:kern w:val="0"/>
+          <w:sz w:val="21"/>
+          <w:szCs w:val="21"/>
+          <w:lang w:eastAsia="en-PH"/>
+          <w14:ligatures w14:val="none"/>
+        </w:rPr>
+        <w:t>events_cust_merged</w:t>
+      </w:r>
+      <w:r>
+        <w:rPr>
+          <w:rFonts w:ascii="Consolas" w:eastAsia="Times New Roman" w:hAnsi="Consolas" w:cs="Times New Roman"/>
+          <w:color w:val="CCCCCC"/>
+          <w:kern w:val="0"/>
+          <w:sz w:val="21"/>
+          <w:szCs w:val="21"/>
+          <w:lang w:eastAsia="en-PH"/>
+          <w14:ligatures w14:val="none"/>
+        </w:rPr>
+        <w:t>.</w:t>
+      </w:r>
+      <w:r>
+        <w:rPr>
+          <w:rFonts w:ascii="Consolas" w:eastAsia="Times New Roman" w:hAnsi="Consolas" w:cs="Times New Roman"/>
+          <w:color w:val="DCDCAA"/>
+          <w:kern w:val="0"/>
+          <w:sz w:val="21"/>
+          <w:szCs w:val="21"/>
+          <w:lang w:eastAsia="en-PH"/>
+          <w14:ligatures w14:val="none"/>
+        </w:rPr>
+        <w:t>merge</w:t>
+      </w:r>
+      <w:r>
+        <w:rPr>
+          <w:rFonts w:ascii="Consolas" w:eastAsia="Times New Roman" w:hAnsi="Consolas" w:cs="Times New Roman"/>
+          <w:color w:val="CCCCCC"/>
+          <w:kern w:val="0"/>
+          <w:sz w:val="21"/>
+          <w:szCs w:val="21"/>
+          <w:lang w:eastAsia="en-PH"/>
+          <w14:ligatures w14:val="none"/>
+        </w:rPr>
+        <w:t>(</w:t>
+      </w:r>
+      <w:r>
+        <w:rPr>
+          <w:rFonts w:ascii="Consolas" w:eastAsia="Times New Roman" w:hAnsi="Consolas" w:cs="Times New Roman"/>
+          <w:color w:val="9CDCFE"/>
+          <w:kern w:val="0"/>
+          <w:sz w:val="21"/>
+          <w:szCs w:val="21"/>
+          <w:lang w:eastAsia="en-PH"/>
+          <w14:ligatures w14:val="none"/>
+        </w:rPr>
+        <w:t>offers_trial</w:t>
+      </w:r>
+      <w:r>
+        <w:rPr>
+          <w:rFonts w:ascii="Consolas" w:eastAsia="Times New Roman" w:hAnsi="Consolas" w:cs="Times New Roman"/>
+          <w:color w:val="CCCCCC"/>
+          <w:kern w:val="0"/>
+          <w:sz w:val="21"/>
+          <w:szCs w:val="21"/>
+          <w:lang w:eastAsia="en-PH"/>
+          <w14:ligatures w14:val="none"/>
+        </w:rPr>
+        <w:t xml:space="preserve">, </w:t>
+      </w:r>
+      <w:r>
+        <w:rPr>
+          <w:rFonts w:ascii="Consolas" w:eastAsia="Times New Roman" w:hAnsi="Consolas" w:cs="Times New Roman"/>
+          <w:color w:val="9CDCFE"/>
+          <w:kern w:val="0"/>
+          <w:sz w:val="21"/>
+          <w:szCs w:val="21"/>
+          <w:lang w:eastAsia="en-PH"/>
+          <w14:ligatures w14:val="none"/>
+        </w:rPr>
+        <w:t>how</w:t>
+      </w:r>
+      <w:r>
+        <w:rPr>
+          <w:rFonts w:ascii="Consolas" w:eastAsia="Times New Roman" w:hAnsi="Consolas" w:cs="Times New Roman"/>
+          <w:color w:val="CCCCCC"/>
+          <w:kern w:val="0"/>
+          <w:sz w:val="21"/>
+          <w:szCs w:val="21"/>
+          <w:lang w:eastAsia="en-PH"/>
+          <w14:ligatures w14:val="none"/>
+        </w:rPr>
+        <w:t xml:space="preserve"> </w:t>
+      </w:r>
+      <w:r>
+        <w:rPr>
+          <w:rFonts w:ascii="Consolas" w:eastAsia="Times New Roman" w:hAnsi="Consolas" w:cs="Times New Roman"/>
+          <w:color w:val="D4D4D4"/>
+          <w:kern w:val="0"/>
+          <w:sz w:val="21"/>
+          <w:szCs w:val="21"/>
+          <w:lang w:eastAsia="en-PH"/>
+          <w14:ligatures w14:val="none"/>
+        </w:rPr>
+        <w:t>=</w:t>
+      </w:r>
+      <w:r>
+        <w:rPr>
+          <w:rFonts w:ascii="Consolas" w:eastAsia="Times New Roman" w:hAnsi="Consolas" w:cs="Times New Roman"/>
+          <w:color w:val="CCCCCC"/>
+          <w:kern w:val="0"/>
+          <w:sz w:val="21"/>
+          <w:szCs w:val="21"/>
+          <w:lang w:eastAsia="en-PH"/>
+          <w14:ligatures w14:val="none"/>
+        </w:rPr>
+        <w:t xml:space="preserve"> </w:t>
+      </w:r>
+      <w:r>
+        <w:rPr>
+          <w:rFonts w:ascii="Consolas" w:eastAsia="Times New Roman" w:hAnsi="Consolas" w:cs="Times New Roman"/>
+          <w:color w:val="CE9178"/>
+          <w:kern w:val="0"/>
+          <w:sz w:val="21"/>
+          <w:szCs w:val="21"/>
+          <w:lang w:eastAsia="en-PH"/>
+          <w14:ligatures w14:val="none"/>
+        </w:rPr>
+        <w:t>'left'</w:t>
+      </w:r>
+      <w:r>
+        <w:rPr>
+          <w:rFonts w:ascii="Consolas" w:eastAsia="Times New Roman" w:hAnsi="Consolas" w:cs="Times New Roman"/>
+          <w:color w:val="CCCCCC"/>
+          <w:kern w:val="0"/>
+          <w:sz w:val="21"/>
+          <w:szCs w:val="21"/>
+          <w:lang w:eastAsia="en-PH"/>
+          <w14:ligatures w14:val="none"/>
+        </w:rPr>
+        <w:t xml:space="preserve">, </w:t>
+      </w:r>
+      <w:r>
+        <w:rPr>
+          <w:rFonts w:ascii="Consolas" w:eastAsia="Times New Roman" w:hAnsi="Consolas" w:cs="Times New Roman"/>
+          <w:color w:val="9CDCFE"/>
+          <w:kern w:val="0"/>
+          <w:sz w:val="21"/>
+          <w:szCs w:val="21"/>
+          <w:lang w:eastAsia="en-PH"/>
+          <w14:ligatures w14:val="none"/>
+        </w:rPr>
+        <w:t>left_on</w:t>
+      </w:r>
+      <w:r>
+        <w:rPr>
+          <w:rFonts w:ascii="Consolas" w:eastAsia="Times New Roman" w:hAnsi="Consolas" w:cs="Times New Roman"/>
+          <w:color w:val="D4D4D4"/>
+          <w:kern w:val="0"/>
+          <w:sz w:val="21"/>
+          <w:szCs w:val="21"/>
+          <w:lang w:eastAsia="en-PH"/>
+          <w14:ligatures w14:val="none"/>
+        </w:rPr>
+        <w:t>=</w:t>
+      </w:r>
+      <w:r>
+        <w:rPr>
+          <w:rFonts w:ascii="Consolas" w:eastAsia="Times New Roman" w:hAnsi="Consolas" w:cs="Times New Roman"/>
+          <w:color w:val="CE9178"/>
+          <w:kern w:val="0"/>
+          <w:sz w:val="21"/>
+          <w:szCs w:val="21"/>
+          <w:lang w:eastAsia="en-PH"/>
+          <w14:ligatures w14:val="none"/>
+        </w:rPr>
+        <w:t>'offer id'</w:t>
+      </w:r>
+      <w:r>
+        <w:rPr>
+          <w:rFonts w:ascii="Consolas" w:eastAsia="Times New Roman" w:hAnsi="Consolas" w:cs="Times New Roman"/>
+          <w:color w:val="CCCCCC"/>
+          <w:kern w:val="0"/>
+          <w:sz w:val="21"/>
+          <w:szCs w:val="21"/>
+          <w:lang w:eastAsia="en-PH"/>
+          <w14:ligatures w14:val="none"/>
+        </w:rPr>
+        <w:t xml:space="preserve">, </w:t>
+      </w:r>
+      <w:r>
+        <w:rPr>
+          <w:rFonts w:ascii="Consolas" w:eastAsia="Times New Roman" w:hAnsi="Consolas" w:cs="Times New Roman"/>
+          <w:color w:val="9CDCFE"/>
+          <w:kern w:val="0"/>
+          <w:sz w:val="21"/>
+          <w:szCs w:val="21"/>
+          <w:lang w:eastAsia="en-PH"/>
+          <w14:ligatures w14:val="none"/>
+        </w:rPr>
+        <w:t>right_on</w:t>
+      </w:r>
+      <w:r>
+        <w:rPr>
+          <w:rFonts w:ascii="Consolas" w:eastAsia="Times New Roman" w:hAnsi="Consolas" w:cs="Times New Roman"/>
+          <w:color w:val="D4D4D4"/>
+          <w:kern w:val="0"/>
+          <w:sz w:val="21"/>
+          <w:szCs w:val="21"/>
+          <w:lang w:eastAsia="en-PH"/>
+          <w14:ligatures w14:val="none"/>
+        </w:rPr>
+        <w:t>=</w:t>
+      </w:r>
+      <w:r>
+        <w:rPr>
+          <w:rFonts w:ascii="Consolas" w:eastAsia="Times New Roman" w:hAnsi="Consolas" w:cs="Times New Roman"/>
+          <w:color w:val="CE9178"/>
+          <w:kern w:val="0"/>
+          <w:sz w:val="21"/>
+          <w:szCs w:val="21"/>
+          <w:lang w:eastAsia="en-PH"/>
+          <w14:ligatures w14:val="none"/>
+        </w:rPr>
+        <w:t>'offer_id'</w:t>
+      </w:r>
+      <w:r>
+        <w:rPr>
+          <w:rFonts w:ascii="Consolas" w:eastAsia="Times New Roman" w:hAnsi="Consolas" w:cs="Times New Roman"/>
+          <w:color w:val="CCCCCC"/>
+          <w:kern w:val="0"/>
+          <w:sz w:val="21"/>
+          <w:szCs w:val="21"/>
+          <w:lang w:eastAsia="en-PH"/>
+          <w14:ligatures w14:val="none"/>
+        </w:rPr>
+        <w:t>)</w:t>
+      </w:r>
+    </w:p>
+    <w:p>
+      <w:pPr>
+        <w:pStyle w:val="ListParagraph"/>
+        <w:numPr>
+          <w:ilvl w:val="4"/>
+          <w:numId w:val="1"/>
+        </w:numPr>
+      </w:pPr>
+      <w:r>
+        <w:t>offer_id_y has offer ids for those with offer completed, offer viewed, and offer received.</w:t>
+      </w:r>
+    </w:p>
+    <w:p>
+      <w:pPr>
+        <w:pStyle w:val="ListParagraph"/>
+        <w:numPr>
+          <w:ilvl w:val="5"/>
+          <w:numId w:val="1"/>
+        </w:numPr>
+      </w:pPr>
+      <w:r>
+        <w:t>Do note that offer viewed and offer received have offer ids under columns ‘offer id’ and ‘offer_id_y’ while offer completed ALSO has an offer id under ‘completed offer id’</w:t>
+      </w:r>
+    </w:p>
+    <w:p>
+      <w:pPr>
+        <w:pStyle w:val="ListParagraph"/>
+        <w:numPr>
+          <w:ilvl w:val="5"/>
+          <w:numId w:val="1"/>
+        </w:numPr>
+      </w:pPr>
+      <w:r>
+        <w:t>This is again under all_merged_no118 and all_merged_final</w:t>
+      </w:r>
+    </w:p>
+    <w:p>
+      <w:pPr>
+        <w:pStyle w:val="ListParagraph"/>
+        <w:numPr>
+          <w:ilvl w:val="3"/>
+          <w:numId w:val="1"/>
+        </w:numPr>
+      </w:pPr>
+      <w:r>
+        <w:t>Filtered_completedoffers_offers_trial also has 28 columns</w:t>
+      </w:r>
+    </w:p>
+    <w:p>
+      <w:pPr>
+        <w:pStyle w:val="ListParagraph"/>
+        <w:numPr>
+          <w:ilvl w:val="4"/>
+          <w:numId w:val="1"/>
+        </w:numPr>
+      </w:pPr>
+      <w:r>
+        <w:t>It does not have that offer_id_y</w:t>
+      </w:r>
+    </w:p>
+    <w:p>
+      <w:pPr>
+        <w:pStyle w:val="ListParagraph"/>
+        <w:numPr>
+          <w:ilvl w:val="0"/>
+          <w:numId w:val="1"/>
+        </w:numPr>
+      </w:pPr>
+      <w:r>
+        <w:t>This might change because it uses filtered_completedoffers_offers_trial without the 118 removed</w:t>
+      </w:r>
+    </w:p>
+    <w:p>
+      <w:pPr>
+        <w:pStyle w:val="ListParagraph"/>
+        <w:numPr>
+          <w:ilvl w:val="1"/>
+          <w:numId w:val="1"/>
+        </w:numPr>
+      </w:pPr>
+      <w:r>
+        <w:drawing>
+          <wp:inline distT="0" distB="0" distL="0" distR="0" wp14:anchorId="0F09E209" wp14:editId="414BA0A9">
+            <wp:extent cx="4252328" cy="2110923"/>
+            <wp:effectExtent l="0" t="0" r="0" b="3810"/>
+            <wp:docPr id="1690568550" name="Picture 1" descr="A screenshot of a computer program&#10;&#10;AI-generated content may be incorrect."/>
+            <wp:cNvGraphicFramePr>
+              <a:graphicFrameLocks xmlns:a="http://schemas.openxmlformats.org/drawingml/2006/main" noChangeAspect="1"/>
+            </wp:cNvGraphicFramePr>
+            <a:graphic xmlns:a="http://schemas.openxmlformats.org/drawingml/2006/main">
+              <a:graphicData uri="http://schemas.openxmlformats.org/drawingml/2006/picture">
+                <pic:pic xmlns:pic="http://schemas.openxmlformats.org/drawingml/2006/picture">
+                  <pic:nvPicPr>
+                    <pic:cNvPr id="1690568550" name="Picture 1" descr="A screenshot of a computer program&#10;&#10;AI-generated content may be incorrect."/>
+                    <pic:cNvPicPr/>
+                  </pic:nvPicPr>
+                  <pic:blipFill>
+                    <a:blip r:embed="rId10"/>
+                    <a:stretch>
+                      <a:fillRect/>
+                    </a:stretch>
+                  </pic:blipFill>
+                  <pic:spPr>
+                    <a:xfrm>
+                      <a:off x="0" y="0"/>
+                      <a:ext cx="4252328" cy="2110923"/>
+                    </a:xfrm>
+                    <a:prstGeom prst="rect">
+                      <a:avLst/>
+                    </a:prstGeom>
+                  </pic:spPr>
+                </pic:pic>
+              </a:graphicData>
+            </a:graphic>
+          </wp:inline>
+        </w:drawing>
+      </w:r>
+    </w:p>
+    <w:p>
+      <w:pPr>
+        <w:pStyle w:val="ListParagraph"/>
+        <w:numPr>
+          <w:ilvl w:val="1"/>
+          <w:numId w:val="1"/>
+        </w:numPr>
+      </w:pPr>
+      <w:r>
+        <w:t>What was my total transactions and transactbeforeoffer like without 118 like?</w:t>
+      </w:r>
+    </w:p>
+    <w:p>
+      <w:pPr>
+        <w:pStyle w:val="ListParagraph"/>
+        <w:numPr>
+          <w:ilvl w:val="1"/>
+          <w:numId w:val="1"/>
+        </w:numPr>
+      </w:pPr>
+      <w:r>
+        <w:lastRenderedPageBreak/>
+        <w:t xml:space="preserve">Adding these values becomes </w:t>
+      </w:r>
+      <w:r>
+        <w:t>616,623.67999999712</w:t>
+      </w:r>
+      <w:r>
+        <w:t>, which is found somewhere in this document. This is the amount in USD when including the incomplete information from customers (i.e. age 118, no gender, no income).</w:t>
+      </w:r>
+    </w:p>
+    <w:p>
+      <w:pPr>
+        <w:pStyle w:val="ListParagraph"/>
+        <w:numPr>
+          <w:ilvl w:val="2"/>
+          <w:numId w:val="1"/>
+        </w:numPr>
+      </w:pPr>
+      <w:r>
+        <w:t xml:space="preserve">I think this insight is made in a power pivot in Excel (CHECK) </w:t>
+      </w:r>
+    </w:p>
     <w:p/>
     <w:p/>
     <w:sectPr>
@@ -14003,7 +16030,7 @@
         <w:ind w:left="2880" w:hanging="360"/>
       </w:pPr>
     </w:lvl>
-    <w:lvl w:ilvl="4" w:tplc="34090019" w:tentative="1">
+    <w:lvl w:ilvl="4" w:tplc="34090019">
       <w:start w:val="1"/>
       <w:numFmt w:val="lowerLetter"/>
       <w:lvlText w:val="%5."/>
@@ -14012,7 +16039,7 @@
         <w:ind w:left="3600" w:hanging="360"/>
       </w:pPr>
     </w:lvl>
-    <w:lvl w:ilvl="5" w:tplc="3409001B" w:tentative="1">
+    <w:lvl w:ilvl="5" w:tplc="3409001B">
       <w:start w:val="1"/>
       <w:numFmt w:val="lowerRoman"/>
       <w:lvlText w:val="%6."/>

</xml_diff>